<commit_message>
docs(resume): inserting personal resume
</commit_message>
<xml_diff>
--- a/public/adalberto-silveira-resume-2026.docx
+++ b/public/adalberto-silveira-resume-2026.docx
@@ -70,6 +70,29 @@
             <w:u w:val="single"/>
           </w:rPr>
           <w:t xml:space="preserve">github.com/silveiraSoft</w:t>
+        </w:r>
+      </w:hyperlink>
+      <w:r>
+        <w:rPr>
+          <w:rFonts w:ascii="Calibri" w:cs="Calibri" w:eastAsia="Calibri" w:hAnsi="Calibri"/>
+          <w:color w:val="555555"/>
+          <w:sz w:val="18"/>
+          <w:szCs w:val="18"/>
+        </w:rPr>
+        <w:t xml:space="preserve">  ·  </w:t>
+      </w:r>
+      <w:hyperlink w:history="1" r:id="rIdportfolio01livepf02">
+        <w:r>
+          <w:rPr>
+            <w:rFonts w:ascii="Calibri" w:cs="Calibri" w:eastAsia="Calibri" w:hAnsi="Calibri"/>
+            <w:b/>
+            <w:bCs/>
+            <w:color w:val="C0392B"/>
+            <w:sz w:val="18"/>
+            <w:szCs w:val="18"/>
+            <w:u w:val="single"/>
+          </w:rPr>
+          <w:t xml:space="preserve">View Live Portfolio &amp; AI Projects →</w:t>
         </w:r>
       </w:hyperlink>
     </w:p>

</xml_diff>

<commit_message>
feat: add Azure MSAL auth project, AWS Monitor live link, update resume with project links
</commit_message>
<xml_diff>
--- a/public/adalberto-silveira-resume-2026.docx
+++ b/public/adalberto-silveira-resume-2026.docx
@@ -800,7 +800,110 @@
           <w:sz w:val="19"/>
           <w:szCs w:val="19"/>
         </w:rPr>
-        <w:t xml:space="preserve">Built an AWS infrastructure monitoring system powered by Amazon Bedrock: intelligent resource-health analysis, anomaly detection, automated CloudWatch metric aggregation, and natural-language incident summaries — reducing mean time to detect (MTTD) for infrastructure issues.</w:t>
+        <w:t xml:space="preserve">Built </w:t>
+      </w:r>
+      <w:hyperlink r:id="rIdawsmonitorghub01" w:history="1">
+        <w:r>
+          <w:rPr>
+            <w:rFonts w:ascii="Calibri" w:cs="Calibri" w:eastAsia="Calibri" w:hAnsi="Calibri"/>
+            <w:color w:val="1155CC"/>
+            <w:sz w:val="19"/>
+            <w:szCs w:val="19"/>
+            <w:u w:val="single"/>
+          </w:rPr>
+          <w:t>AWS Monitor Agent</w:t>
+        </w:r>
+      </w:hyperlink>
+      <w:r>
+        <w:rPr>
+          <w:rFonts w:ascii="Calibri" w:cs="Calibri" w:eastAsia="Calibri" w:hAnsi="Calibri"/>
+          <w:color w:val="2d2d2d"/>
+          <w:sz w:val="19"/>
+          <w:szCs w:val="19"/>
+        </w:rPr>
+        <w:t xml:space="preserve"> — an AI-powered infrastructure monitoring system using Amazon Bedrock: intelligent EC2/Lambda/CloudWatch health analysis, anomaly detection, natural-language incident summaries, multi-region support (30+ AWS regions). 121 tests, fully serverless, &lt;$0.02/month at rest. Live: </w:t>
+      </w:r>
+      <w:hyperlink r:id="rIdawsmonitorlive01" w:history="1">
+        <w:r>
+          <w:rPr>
+            <w:rFonts w:ascii="Calibri" w:cs="Calibri" w:eastAsia="Calibri" w:hAnsi="Calibri"/>
+            <w:color w:val="1155CC"/>
+            <w:sz w:val="19"/>
+            <w:szCs w:val="19"/>
+            <w:u w:val="single"/>
+          </w:rPr>
+          <w:t>d2gfdp4qsgu81s.cloudfront.net</w:t>
+        </w:r>
+      </w:hyperlink>
+      <w:r>
+        <w:rPr>
+          <w:rFonts w:ascii="Calibri" w:cs="Calibri" w:eastAsia="Calibri" w:hAnsi="Calibri"/>
+          <w:color w:val="2d2d2d"/>
+          <w:sz w:val="19"/>
+          <w:szCs w:val="19"/>
+        </w:rPr>
+        <w:t>.</w:t>
+      </w:r>
+    </w:p>
+    <w:p>
+      <w:pPr>
+        <w:pStyle w:val="ListParagraph"/>
+        <w:numPr>
+          <w:ilvl w:val="0"/>
+          <w:numId w:val="2"/>
+        </w:numPr>
+        <w:spacing w:after="30" w:before="30"/>
+      </w:pPr>
+      <w:r>
+        <w:rPr>
+          <w:rFonts w:ascii="Calibri" w:cs="Calibri" w:eastAsia="Calibri" w:hAnsi="Calibri"/>
+          <w:color w:val="2d2d2d"/>
+          <w:sz w:val="19"/>
+          <w:szCs w:val="19"/>
+        </w:rPr>
+        <w:t xml:space="preserve">Built </w:t>
+      </w:r>
+      <w:hyperlink r:id="rIdazuremsalghub01" w:history="1">
+        <w:r>
+          <w:rPr>
+            <w:rFonts w:ascii="Calibri" w:cs="Calibri" w:eastAsia="Calibri" w:hAnsi="Calibri"/>
+            <w:color w:val="1155CC"/>
+            <w:sz w:val="19"/>
+            <w:szCs w:val="19"/>
+            <w:u w:val="single"/>
+          </w:rPr>
+          <w:t>Azure AD / Entra ID Auth Demo</w:t>
+        </w:r>
+      </w:hyperlink>
+      <w:r>
+        <w:rPr>
+          <w:rFonts w:ascii="Calibri" w:cs="Calibri" w:eastAsia="Calibri" w:hAnsi="Calibri"/>
+          <w:color w:val="2d2d2d"/>
+          <w:sz w:val="19"/>
+          <w:szCs w:val="19"/>
+        </w:rPr>
+        <w:t xml:space="preserve"> — a full-stack enterprise authentication demo (Next.js 14 + Spring Boot 3 + Spring Security) implementing OAuth 2.0 PKCE flow for browser clients and Client Credentials flow for machine-to-machine auth, with role-based access control (Admin/User), PostgreSQL/Neon persistence, and zero-cost cloud deployment (Vercel + Render). Live: </w:t>
+      </w:r>
+      <w:hyperlink r:id="rIdazuremsallive01" w:history="1">
+        <w:r>
+          <w:rPr>
+            <w:rFonts w:ascii="Calibri" w:cs="Calibri" w:eastAsia="Calibri" w:hAnsi="Calibri"/>
+            <w:color w:val="1155CC"/>
+            <w:sz w:val="19"/>
+            <w:szCs w:val="19"/>
+            <w:u w:val="single"/>
+          </w:rPr>
+          <w:t>azure-msal-nextjs-springboot-demo.vercel.app</w:t>
+        </w:r>
+      </w:hyperlink>
+      <w:r>
+        <w:rPr>
+          <w:rFonts w:ascii="Calibri" w:cs="Calibri" w:eastAsia="Calibri" w:hAnsi="Calibri"/>
+          <w:color w:val="2d2d2d"/>
+          <w:sz w:val="19"/>
+          <w:szCs w:val="19"/>
+        </w:rPr>
+        <w:t>.</w:t>
       </w:r>
     </w:p>
     <w:p>

</xml_diff>

<commit_message>
feat: add Security & Identity skills category, update resume skills for Azure MSAL project
</commit_message>
<xml_diff>
--- a/public/adalberto-silveira-resume-2026.docx
+++ b/public/adalberto-silveira-resume-2026.docx
@@ -179,7 +179,7 @@
           <w:sz w:val="19"/>
           <w:szCs w:val="19"/>
         </w:rPr>
-        <w:t xml:space="preserve">Java 8/11/17/21/25, Spring Boot, Spring WebFlux, Project Reactor, Spring MVC, Spring Security, Spring Cloud, Spring Data JPA/Hibernate, Reactive Programming, Microservices, Event-Driven Architecture, REST APIs, gRPC</w:t>
+        <w:t xml:space="preserve">Java 8/11/17/21/25, Spring Boot, Spring WebFlux, Project Reactor, Spring MVC, Spring Security (JWT Validation, RBAC), Spring Cloud, Spring Data JPA/Hibernate, Reactive Programming, Microservices, Event-Driven Architecture, REST APIs, gRPC</w:t>
       </w:r>
     </w:p>
     <w:p>
@@ -204,7 +204,7 @@
           <w:sz w:val="19"/>
           <w:szCs w:val="19"/>
         </w:rPr>
-        <w:t xml:space="preserve">Lambda, SNS/SQS, S3, API Gateway, RDS, DynamoDB, Amazon Cognito, CloudWatch, IAM, Parameter Store, Amazon Bedrock</w:t>
+        <w:t xml:space="preserve">Lambda, SNS/SQS, S3, API Gateway, RDS, DynamoDB, Amazon Cognito, CloudWatch, IAM, Parameter Store, Amazon Bedrock; Azure AD / Entra ID (Microsoft Entra), MSAL.js</w:t>
       </w:r>
     </w:p>
     <w:p>
@@ -254,7 +254,7 @@
           <w:sz w:val="19"/>
           <w:szCs w:val="19"/>
         </w:rPr>
-        <w:t xml:space="preserve">ReactJS, Next.js, TypeScript, Node.js 22, Angular, Remix, HTML5, CSS3</w:t>
+        <w:t xml:space="preserve">ReactJS, Next.js 14, TypeScript, Node.js 22, MSAL.js, Angular, Remix, HTML5, CSS3</w:t>
       </w:r>
     </w:p>
     <w:p>
@@ -329,7 +329,7 @@
           <w:sz w:val="19"/>
           <w:szCs w:val="19"/>
         </w:rPr>
-        <w:t xml:space="preserve">Clean Architecture, SOLID, DDD, CQRS, OAuth 2.0, JWT, AES/RSA Encryption, Event Sourcing, Saga Pattern</w:t>
+        <w:t xml:space="preserve">Clean Architecture, SOLID, DDD, CQRS, OAuth 2.0 (PKCE · Client Credentials Flow), JWT, RBAC, AES/RSA Encryption, Event Sourcing, Saga Pattern</w:t>
       </w:r>
     </w:p>
     <w:p>

</xml_diff>